<commit_message>
docs(001): agregar mensaje de bloqueo configurable (RF-07)
</commit_message>
<xml_diff>
--- a/Documentacion/requerimiento_bloqueo.docx
+++ b/Documentacion/requerimiento_bloqueo.docx
@@ -377,6 +377,34 @@
                 <w:sz w:val="20"/>
               </w:rPr>
               <w:t>El sistema debe permitir activar, consultar y cancelar los bloqueos definidos.</w:t>
+            </w:r>
+          </w:p>
+        </w:tc>
+      </w:tr>
+      <w:tr>
+        <w:tc>
+          <w:tcPr>
+            <w:tcW w:type="dxa" w:w="4320"/>
+          </w:tcPr>
+          <w:p>
+            <w:r>
+              <w:rPr>
+                <w:sz w:val="20"/>
+              </w:rPr>
+              <w:t>RF-05</w:t>
+            </w:r>
+          </w:p>
+        </w:tc>
+        <w:tc>
+          <w:tcPr>
+            <w:tcW w:type="dxa" w:w="4320"/>
+          </w:tcPr>
+          <w:p>
+            <w:r>
+              <w:rPr>
+                <w:sz w:val="20"/>
+              </w:rPr>
+              <w:t>El sistema debe permitir configurar el mensaje de bloqueo que se muestra al intentar abrir la aplicacion bloqueada en el periodo de bloqueo.</w:t>
             </w:r>
           </w:p>
         </w:tc>

</xml_diff>

<commit_message>
feat(bloqueo): boton Desbloquear y mensaje editable en mockup (RF-06/RF-07)
</commit_message>
<xml_diff>
--- a/Documentacion/requerimiento_bloqueo.docx
+++ b/Documentacion/requerimiento_bloqueo.docx
@@ -404,7 +404,35 @@
               <w:rPr>
                 <w:sz w:val="20"/>
               </w:rPr>
-              <w:t>El sistema debe permitir configurar el mensaje de bloqueo que se muestra al intentar abrir la aplicacion bloqueada en el periodo de bloqueo.</w:t>
+              <w:t>El sistema debe permitir configurar el mensaje de bloqueo que se muestra al intentar abrir la aplicacion bloqueada en el periodo de bloqueo, y editarlo desde la pantalla de bloqueo.</w:t>
+            </w:r>
+          </w:p>
+        </w:tc>
+      </w:tr>
+      <w:tr>
+        <w:tc>
+          <w:tcPr>
+            <w:tcW w:type="dxa" w:w="4320"/>
+          </w:tcPr>
+          <w:p>
+            <w:r>
+              <w:rPr>
+                <w:sz w:val="20"/>
+              </w:rPr>
+              <w:t>RF-06</w:t>
+            </w:r>
+          </w:p>
+        </w:tc>
+        <w:tc>
+          <w:tcPr>
+            <w:tcW w:type="dxa" w:w="4320"/>
+          </w:tcPr>
+          <w:p>
+            <w:r>
+              <w:rPr>
+                <w:sz w:val="20"/>
+              </w:rPr>
+              <w:t>El sistema debe permitir desbloquear la aplicacion desde la pantalla de bloqueo mediante el boton Desbloquear.</w:t>
             </w:r>
           </w:p>
         </w:tc>

</xml_diff>